<commit_message>
Code indentation and line breaks fixed
</commit_message>
<xml_diff>
--- a/QCPA_r-script-doc-styles.docx
+++ b/QCPA_r-script-doc-styles.docx
@@ -5,8 +5,12 @@
     <w:sdt>
       <w:sdtPr>
         <w:rPr>
+          <w:rFonts w:eastAsiaTheme="minorHAnsi" w:cstheme="minorBidi"/>
           <w:b/>
           <w:bCs/>
+          <w:color w:val="auto"/>
+          <w:sz w:val="24"/>
+          <w:szCs w:val="24"/>
         </w:rPr>
         <w:id w:val="1582643175"/>
         <w:docPartObj>
@@ -19,14 +23,12 @@
           <w:rFonts w:cs="Arial"/>
           <w:b w:val="0"/>
           <w:bCs w:val="0"/>
-          <w:sz w:val="24"/>
-          <w:szCs w:val="24"/>
         </w:rPr>
       </w:sdtEndPr>
       <w:sdtContent>
         <w:p>
           <w:pPr>
-            <w:pStyle w:val="Abstract"/>
+            <w:pStyle w:val="Heading1"/>
           </w:pPr>
           <w:r>
             <w:t>Table of Contents</w:t>
@@ -34,10 +36,12 @@
         </w:p>
         <w:p>
           <w:pPr>
+            <w:pStyle w:val="BodyText"/>
+          </w:pPr>
+        </w:p>
+        <w:p>
+          <w:pPr>
             <w:pStyle w:val="TOC1"/>
-            <w:tabs>
-              <w:tab w:val="right" w:leader="dot" w:pos="9350"/>
-            </w:tabs>
             <w:rPr>
               <w:rFonts w:eastAsiaTheme="minorEastAsia"/>
               <w:noProof/>
@@ -131,10 +135,6 @@
         <w:p>
           <w:pPr>
             <w:pStyle w:val="TOC1"/>
-            <w:tabs>
-              <w:tab w:val="left" w:pos="480"/>
-              <w:tab w:val="right" w:leader="dot" w:pos="9350"/>
-            </w:tabs>
             <w:rPr>
               <w:rFonts w:eastAsiaTheme="minorEastAsia"/>
               <w:noProof/>
@@ -221,10 +221,6 @@
         <w:p>
           <w:pPr>
             <w:pStyle w:val="TOC2"/>
-            <w:tabs>
-              <w:tab w:val="left" w:pos="880"/>
-              <w:tab w:val="right" w:leader="dot" w:pos="9350"/>
-            </w:tabs>
             <w:rPr>
               <w:rFonts w:eastAsiaTheme="minorEastAsia"/>
               <w:noProof/>
@@ -311,10 +307,6 @@
         <w:p>
           <w:pPr>
             <w:pStyle w:val="TOC3"/>
-            <w:tabs>
-              <w:tab w:val="left" w:pos="1320"/>
-              <w:tab w:val="right" w:leader="dot" w:pos="9350"/>
-            </w:tabs>
             <w:rPr>
               <w:rFonts w:eastAsiaTheme="minorEastAsia"/>
               <w:noProof/>
@@ -401,10 +393,6 @@
         <w:p>
           <w:pPr>
             <w:pStyle w:val="TOC3"/>
-            <w:tabs>
-              <w:tab w:val="left" w:pos="1320"/>
-              <w:tab w:val="right" w:leader="dot" w:pos="9350"/>
-            </w:tabs>
             <w:rPr>
               <w:rFonts w:eastAsiaTheme="minorEastAsia"/>
               <w:noProof/>
@@ -491,10 +479,6 @@
         <w:p>
           <w:pPr>
             <w:pStyle w:val="TOC2"/>
-            <w:tabs>
-              <w:tab w:val="left" w:pos="880"/>
-              <w:tab w:val="right" w:leader="dot" w:pos="9350"/>
-            </w:tabs>
             <w:rPr>
               <w:rFonts w:eastAsiaTheme="minorEastAsia"/>
               <w:noProof/>
@@ -581,10 +565,6 @@
         <w:p>
           <w:pPr>
             <w:pStyle w:val="TOC1"/>
-            <w:tabs>
-              <w:tab w:val="left" w:pos="480"/>
-              <w:tab w:val="right" w:leader="dot" w:pos="9350"/>
-            </w:tabs>
             <w:rPr>
               <w:rFonts w:eastAsiaTheme="minorEastAsia"/>
               <w:noProof/>
@@ -757,10 +737,6 @@
         <w:p>
           <w:pPr>
             <w:pStyle w:val="TOC2"/>
-            <w:tabs>
-              <w:tab w:val="left" w:pos="880"/>
-              <w:tab w:val="right" w:leader="dot" w:pos="9350"/>
-            </w:tabs>
             <w:rPr>
               <w:rFonts w:eastAsiaTheme="minorEastAsia"/>
               <w:noProof/>
@@ -847,10 +823,6 @@
         <w:p>
           <w:pPr>
             <w:pStyle w:val="TOC1"/>
-            <w:tabs>
-              <w:tab w:val="left" w:pos="480"/>
-              <w:tab w:val="right" w:leader="dot" w:pos="9350"/>
-            </w:tabs>
             <w:rPr>
               <w:rFonts w:eastAsiaTheme="minorEastAsia"/>
               <w:noProof/>
@@ -937,10 +909,6 @@
         <w:p>
           <w:pPr>
             <w:pStyle w:val="TOC1"/>
-            <w:tabs>
-              <w:tab w:val="left" w:pos="480"/>
-              <w:tab w:val="right" w:leader="dot" w:pos="9350"/>
-            </w:tabs>
             <w:rPr>
               <w:rFonts w:eastAsiaTheme="minorEastAsia"/>
               <w:noProof/>
@@ -1027,10 +995,6 @@
         <w:p>
           <w:pPr>
             <w:pStyle w:val="TOC1"/>
-            <w:tabs>
-              <w:tab w:val="left" w:pos="480"/>
-              <w:tab w:val="right" w:leader="dot" w:pos="9350"/>
-            </w:tabs>
             <w:rPr>
               <w:rFonts w:eastAsiaTheme="minorEastAsia"/>
               <w:noProof/>
@@ -1117,10 +1081,6 @@
         <w:p>
           <w:pPr>
             <w:pStyle w:val="TOC2"/>
-            <w:tabs>
-              <w:tab w:val="left" w:pos="880"/>
-              <w:tab w:val="right" w:leader="dot" w:pos="9350"/>
-            </w:tabs>
             <w:rPr>
               <w:rFonts w:eastAsiaTheme="minorEastAsia"/>
               <w:noProof/>
@@ -1207,10 +1167,6 @@
         <w:p>
           <w:pPr>
             <w:pStyle w:val="TOC3"/>
-            <w:tabs>
-              <w:tab w:val="left" w:pos="1320"/>
-              <w:tab w:val="right" w:leader="dot" w:pos="9350"/>
-            </w:tabs>
             <w:rPr>
               <w:rFonts w:eastAsiaTheme="minorEastAsia"/>
               <w:noProof/>
@@ -1297,10 +1253,6 @@
         <w:p>
           <w:pPr>
             <w:pStyle w:val="TOC3"/>
-            <w:tabs>
-              <w:tab w:val="left" w:pos="1320"/>
-              <w:tab w:val="right" w:leader="dot" w:pos="9350"/>
-            </w:tabs>
             <w:rPr>
               <w:rFonts w:eastAsiaTheme="minorEastAsia"/>
               <w:noProof/>
@@ -1387,10 +1339,6 @@
         <w:p>
           <w:pPr>
             <w:pStyle w:val="TOC2"/>
-            <w:tabs>
-              <w:tab w:val="left" w:pos="880"/>
-              <w:tab w:val="right" w:leader="dot" w:pos="9350"/>
-            </w:tabs>
             <w:rPr>
               <w:rFonts w:eastAsiaTheme="minorEastAsia"/>
               <w:noProof/>
@@ -1477,10 +1425,6 @@
         <w:p>
           <w:pPr>
             <w:pStyle w:val="TOC1"/>
-            <w:tabs>
-              <w:tab w:val="left" w:pos="480"/>
-              <w:tab w:val="right" w:leader="dot" w:pos="9350"/>
-            </w:tabs>
             <w:rPr>
               <w:rFonts w:eastAsiaTheme="minorEastAsia"/>
               <w:noProof/>
@@ -1567,10 +1511,6 @@
         <w:p>
           <w:pPr>
             <w:pStyle w:val="TOC1"/>
-            <w:tabs>
-              <w:tab w:val="left" w:pos="480"/>
-              <w:tab w:val="right" w:leader="dot" w:pos="9350"/>
-            </w:tabs>
             <w:rPr>
               <w:rFonts w:eastAsiaTheme="minorEastAsia"/>
               <w:noProof/>
@@ -1657,10 +1597,6 @@
         <w:p>
           <w:pPr>
             <w:pStyle w:val="TOC1"/>
-            <w:tabs>
-              <w:tab w:val="left" w:pos="480"/>
-              <w:tab w:val="right" w:leader="dot" w:pos="9350"/>
-            </w:tabs>
             <w:rPr>
               <w:rFonts w:eastAsiaTheme="minorEastAsia"/>
               <w:noProof/>
@@ -1829,7 +1765,11 @@
       </w:r>
       <w:proofErr w:type="gramEnd"/>
       <w:r>
-        <w:t>)). For clarity we recommend that, you as the user, need to be comfortable with the differences data types (e.g., numerical, character, factors) and data structures such as lists (collection of mixed data types) and data frames (special type of list). We also provide different methods to extract data, ideally introducing different coding methods as well as providing ways to increase efficiency of data wrangling.</w:t>
+        <w:t xml:space="preserve">)). For clarity we recommend that, you as the user, need to be comfortable with the differences data types (e.g., numerical, character, factors) and data structures such </w:t>
+      </w:r>
+      <w:r>
+        <w:lastRenderedPageBreak/>
+        <w:t>as lists (collection of mixed data types) and data frames (special type of list). We also provide different methods to extract data, ideally introducing different coding methods as well as providing ways to increase efficiency of data wrangling.</w:t>
       </w:r>
     </w:p>
     <w:p>
@@ -1868,11 +1808,10 @@
     </w:p>
     <w:p>
       <w:pPr>
-        <w:pStyle w:val="FirstParagraph"/>
+        <w:pStyle w:val="Heading1"/>
       </w:pPr>
       <w:bookmarkStart w:id="1" w:name="setup"/>
       <w:r>
-        <w:lastRenderedPageBreak/>
         <w:t xml:space="preserve">there should be two subfolders for the two species, </w:t>
       </w:r>
       <w:r>
@@ -2484,6 +2423,7 @@
         <w:rPr>
           <w:rFonts w:cs="Arial"/>
         </w:rPr>
+        <w:lastRenderedPageBreak/>
         <w:t>Table 1. QCPA image analysis and associated output files</w:t>
       </w:r>
     </w:p>
@@ -2927,7 +2867,6 @@
               <w:rPr>
                 <w:rFonts w:cs="Arial"/>
               </w:rPr>
-              <w:lastRenderedPageBreak/>
               <w:t>6</w:t>
             </w:r>
           </w:p>
@@ -3789,6 +3728,7 @@
         <w:rPr>
           <w:rStyle w:val="SectionNumber"/>
         </w:rPr>
+        <w:lastRenderedPageBreak/>
         <w:t>3</w:t>
       </w:r>
       <w:r>
@@ -3835,7 +3775,6 @@
         <w:rPr>
           <w:rStyle w:val="SectionNumber"/>
         </w:rPr>
-        <w:lastRenderedPageBreak/>
         <w:t>3.1</w:t>
       </w:r>
       <w:r>
@@ -4566,6 +4505,7 @@
           <w:rFonts w:ascii="Arial" w:hAnsi="Arial" w:cs="Arial"/>
         </w:rPr>
       </w:pPr>
+      <w:proofErr w:type="gramStart"/>
       <w:r>
         <w:rPr>
           <w:rStyle w:val="FunctionTok"/>
@@ -4578,7 +4518,24 @@
           <w:rStyle w:val="NormalTok"/>
           <w:rFonts w:ascii="Arial" w:hAnsi="Arial" w:cs="Arial"/>
         </w:rPr>
-        <w:t>(Sum_Res_df)[,</w:t>
+        <w:t>(</w:t>
+      </w:r>
+      <w:proofErr w:type="spellStart"/>
+      <w:proofErr w:type="gramEnd"/>
+      <w:r>
+        <w:rPr>
+          <w:rStyle w:val="NormalTok"/>
+          <w:rFonts w:ascii="Arial" w:hAnsi="Arial" w:cs="Arial"/>
+        </w:rPr>
+        <w:t>Sum_Res_df</w:t>
+      </w:r>
+      <w:proofErr w:type="spellEnd"/>
+      <w:r>
+        <w:rPr>
+          <w:rStyle w:val="NormalTok"/>
+          <w:rFonts w:ascii="Arial" w:hAnsi="Arial" w:cs="Arial"/>
+        </w:rPr>
+        <w:t>)[,</w:t>
       </w:r>
       <w:r>
         <w:rPr>
@@ -4693,6 +4650,7 @@
           <w:rStyle w:val="VerbatimChar"/>
           <w:rFonts w:ascii="Arial" w:hAnsi="Arial" w:cs="Arial"/>
         </w:rPr>
+        <w:lastRenderedPageBreak/>
         <w:t>## 5        Aplysia sp         4_Aplysiasp_1_NL_N_RAW 30cm animal 1</w:t>
       </w:r>
       <w:r>
@@ -4875,7 +4833,6 @@
           <w:rStyle w:val="VerbatimChar"/>
           <w:rFonts w:ascii="Arial" w:hAnsi="Arial" w:cs="Arial"/>
         </w:rPr>
-        <w:lastRenderedPageBreak/>
         <w:t>## 5 2.095732 0.6985775 1.219512 0.4065041 0.80674082 0.73432714</w:t>
       </w:r>
       <w:r>
@@ -5875,6 +5832,7 @@
           <w:rStyle w:val="NormalTok"/>
           <w:rFonts w:ascii="Arial" w:hAnsi="Arial" w:cs="Arial"/>
         </w:rPr>
+        <w:lastRenderedPageBreak/>
         <w:t xml:space="preserve">    </w:t>
       </w:r>
       <w:r>
@@ -6476,7 +6434,6 @@
           <w:rStyle w:val="NormalTok"/>
           <w:rFonts w:ascii="Arial" w:hAnsi="Arial" w:cs="Arial"/>
         </w:rPr>
-        <w:lastRenderedPageBreak/>
         <w:t xml:space="preserve">  </w:t>
       </w:r>
       <w:r>
@@ -7177,6 +7134,7 @@
           <w:rStyle w:val="VerbatimChar"/>
           <w:rFonts w:ascii="Arial" w:hAnsi="Arial" w:cs="Arial"/>
         </w:rPr>
+        <w:lastRenderedPageBreak/>
         <w:t>## 2          NaN           0           0          NaN              0</w:t>
       </w:r>
       <w:r>
@@ -7359,7 +7317,6 @@
           <w:rStyle w:val="VerbatimChar"/>
           <w:rFonts w:ascii="Arial" w:hAnsi="Arial" w:cs="Arial"/>
         </w:rPr>
-        <w:lastRenderedPageBreak/>
         <w:t>## 1           0          NaN</w:t>
       </w:r>
       <w:r>
@@ -8154,6 +8111,7 @@
           <w:rStyle w:val="CommentTok"/>
           <w:rFonts w:ascii="Arial" w:hAnsi="Arial" w:cs="Arial"/>
         </w:rPr>
+        <w:lastRenderedPageBreak/>
         <w:t># Individual Particle Analysis</w:t>
       </w:r>
       <w:r>
@@ -8451,7 +8409,6 @@
           <w:rStyle w:val="VerbatimChar"/>
           <w:rFonts w:ascii="Arial" w:hAnsi="Arial" w:cs="Arial"/>
         </w:rPr>
-        <w:lastRenderedPageBreak/>
         <w:t>##   ClusterID_Particle.         X        Y        XM       YM   Perim.    Major</w:t>
       </w:r>
       <w:r>
@@ -9492,6 +9449,7 @@
           <w:rStyle w:val="VerbatimChar"/>
           <w:rFonts w:ascii="Arial" w:hAnsi="Arial" w:cs="Arial"/>
         </w:rPr>
+        <w:lastRenderedPageBreak/>
         <w:t>##             Species                            Ind Dist    ROI  Col.mean</w:t>
       </w:r>
       <w:r>
@@ -9687,7 +9645,6 @@
           <w:rStyle w:val="VerbatimChar"/>
           <w:rFonts w:ascii="Arial" w:hAnsi="Arial" w:cs="Arial"/>
         </w:rPr>
-        <w:lastRenderedPageBreak/>
         <w:t>##   Lum.kurtosis.hrz Lum.mean.vrt Lum.sd.vrt Lum.CoV.vrt Lum.skew.vrt</w:t>
       </w:r>
       <w:r>
@@ -10678,6 +10635,7 @@
           <w:rStyle w:val="VerbatimChar"/>
           <w:rFonts w:ascii="Arial" w:hAnsi="Arial" w:cs="Arial"/>
         </w:rPr>
+        <w:lastRenderedPageBreak/>
         <w:t>## 2 Aphelodoris varia 3_AphelodorisVaria_10_NF_D_RAW 30cm</w:t>
       </w:r>
       <w:r>
@@ -10770,7 +10728,6 @@
         <w:rPr>
           <w:rStyle w:val="SectionNumber"/>
         </w:rPr>
-        <w:lastRenderedPageBreak/>
         <w:t>6</w:t>
       </w:r>
       <w:r>
@@ -11862,6 +11819,7 @@
           <w:rStyle w:val="NormalTok"/>
           <w:rFonts w:ascii="Arial" w:hAnsi="Arial" w:cs="Arial"/>
         </w:rPr>
+        <w:lastRenderedPageBreak/>
         <w:t>}</w:t>
       </w:r>
       <w:r>
@@ -11970,7 +11928,6 @@
         <w:rPr>
           <w:rStyle w:val="SectionNumber"/>
         </w:rPr>
-        <w:lastRenderedPageBreak/>
         <w:t>7</w:t>
       </w:r>
       <w:r>
@@ -12035,8 +11992,9 @@
       </w:pPr>
     </w:p>
     <w:sectPr>
+      <w:footerReference w:type="default" r:id="rId7"/>
       <w:pgSz w:w="12240" w:h="15840"/>
-      <w:pgMar w:top="1134" w:right="1134" w:bottom="1134" w:left="1134" w:header="720" w:footer="720" w:gutter="0"/>
+      <w:pgMar w:top="1134" w:right="1134" w:bottom="1134" w:left="1134" w:header="720" w:footer="267" w:gutter="0"/>
       <w:cols w:space="720"/>
     </w:sectPr>
   </w:body>
@@ -12068,6 +12026,65 @@
 </w:endnotes>
 </file>
 
+<file path=word/footer1.xml><?xml version="1.0" encoding="utf-8"?>
+<w:ftr xmlns:wpc="http://schemas.microsoft.com/office/word/2010/wordprocessingCanvas" xmlns:cx="http://schemas.microsoft.com/office/drawing/2014/chartex" xmlns:cx1="http://schemas.microsoft.com/office/drawing/2015/9/8/chartex" xmlns:cx2="http://schemas.microsoft.com/office/drawing/2015/10/21/chartex" xmlns:cx3="http://schemas.microsoft.com/office/drawing/2016/5/9/chartex" xmlns:cx4="http://schemas.microsoft.com/office/drawing/2016/5/10/chartex" xmlns:cx5="http://schemas.microsoft.com/office/drawing/2016/5/11/chartex" xmlns:cx6="http://schemas.microsoft.com/office/drawing/2016/5/12/chartex" xmlns:cx7="http://schemas.microsoft.com/office/drawing/2016/5/13/chartex" xmlns:cx8="http://schemas.microsoft.com/office/drawing/2016/5/14/chartex" xmlns:mc="http://schemas.openxmlformats.org/markup-compatibility/2006" xmlns:aink="http://schemas.microsoft.com/office/drawing/2016/ink" xmlns:am3d="http://schemas.microsoft.com/office/drawing/2017/model3d" xmlns:o="urn:schemas-microsoft-com:office:office" xmlns:r="http://schemas.openxmlformats.org/officeDocument/2006/relationships" xmlns:m="http://schemas.openxmlformats.org/officeDocument/2006/math" xmlns:v="urn:schemas-microsoft-com:vml" xmlns:wp14="http://schemas.microsoft.com/office/word/2010/wordprocessingDrawing" xmlns:wp="http://schemas.openxmlformats.org/drawingml/2006/wordprocessingDrawing" xmlns:w10="urn:schemas-microsoft-com:office:word" xmlns:w="http://schemas.openxmlformats.org/wordprocessingml/2006/main" xmlns:w14="http://schemas.microsoft.com/office/word/2010/wordml" xmlns:w15="http://schemas.microsoft.com/office/word/2012/wordml" xmlns:w16cex="http://schemas.microsoft.com/office/word/2018/wordml/cex" xmlns:w16cid="http://schemas.microsoft.com/office/word/2016/wordml/cid" xmlns:w16="http://schemas.microsoft.com/office/word/2018/wordml" xmlns:w16se="http://schemas.microsoft.com/office/word/2015/wordml/symex" xmlns:wpg="http://schemas.microsoft.com/office/word/2010/wordprocessingGroup" xmlns:wpi="http://schemas.microsoft.com/office/word/2010/wordprocessingInk" xmlns:wne="http://schemas.microsoft.com/office/word/2006/wordml" xmlns:wps="http://schemas.microsoft.com/office/word/2010/wordprocessingShape" mc:Ignorable="w14 w15 w16se w16cid w16 w16cex wp14">
+  <w:sdt>
+    <w:sdtPr>
+      <w:id w:val="1387759526"/>
+      <w:docPartObj>
+        <w:docPartGallery w:val="Page Numbers (Bottom of Page)"/>
+        <w:docPartUnique/>
+      </w:docPartObj>
+    </w:sdtPr>
+    <w:sdtEndPr>
+      <w:rPr>
+        <w:noProof/>
+      </w:rPr>
+    </w:sdtEndPr>
+    <w:sdtContent>
+      <w:p>
+        <w:pPr>
+          <w:pStyle w:val="Footer"/>
+          <w:jc w:val="center"/>
+        </w:pPr>
+      </w:p>
+      <w:p>
+        <w:pPr>
+          <w:pStyle w:val="Footer"/>
+          <w:jc w:val="center"/>
+        </w:pPr>
+        <w:r>
+          <w:fldChar w:fldCharType="begin"/>
+        </w:r>
+        <w:r>
+          <w:instrText xml:space="preserve"> PAGE   \* MERGEFORMAT </w:instrText>
+        </w:r>
+        <w:r>
+          <w:fldChar w:fldCharType="separate"/>
+        </w:r>
+        <w:r>
+          <w:rPr>
+            <w:noProof/>
+          </w:rPr>
+          <w:t>2</w:t>
+        </w:r>
+        <w:r>
+          <w:rPr>
+            <w:noProof/>
+          </w:rPr>
+          <w:fldChar w:fldCharType="end"/>
+        </w:r>
+      </w:p>
+    </w:sdtContent>
+  </w:sdt>
+  <w:p>
+    <w:pPr>
+      <w:pStyle w:val="Footer"/>
+    </w:pPr>
+  </w:p>
+</w:ftr>
+</file>
+
 <file path=word/footnotes.xml><?xml version="1.0" encoding="utf-8"?>
 <w:footnotes xmlns:wpc="http://schemas.microsoft.com/office/word/2010/wordprocessingCanvas" xmlns:cx="http://schemas.microsoft.com/office/drawing/2014/chartex" xmlns:cx1="http://schemas.microsoft.com/office/drawing/2015/9/8/chartex" xmlns:cx2="http://schemas.microsoft.com/office/drawing/2015/10/21/chartex" xmlns:cx3="http://schemas.microsoft.com/office/drawing/2016/5/9/chartex" xmlns:cx4="http://schemas.microsoft.com/office/drawing/2016/5/10/chartex" xmlns:cx5="http://schemas.microsoft.com/office/drawing/2016/5/11/chartex" xmlns:cx6="http://schemas.microsoft.com/office/drawing/2016/5/12/chartex" xmlns:cx7="http://schemas.microsoft.com/office/drawing/2016/5/13/chartex" xmlns:cx8="http://schemas.microsoft.com/office/drawing/2016/5/14/chartex" xmlns:mc="http://schemas.openxmlformats.org/markup-compatibility/2006" xmlns:aink="http://schemas.microsoft.com/office/drawing/2016/ink" xmlns:am3d="http://schemas.microsoft.com/office/drawing/2017/model3d" xmlns:o="urn:schemas-microsoft-com:office:office" xmlns:r="http://schemas.openxmlformats.org/officeDocument/2006/relationships" xmlns:m="http://schemas.openxmlformats.org/officeDocument/2006/math" xmlns:v="urn:schemas-microsoft-com:vml" xmlns:wp14="http://schemas.microsoft.com/office/word/2010/wordprocessingDrawing" xmlns:wp="http://schemas.openxmlformats.org/drawingml/2006/wordprocessingDrawing" xmlns:w10="urn:schemas-microsoft-com:office:word" xmlns:w="http://schemas.openxmlformats.org/wordprocessingml/2006/main" xmlns:w14="http://schemas.microsoft.com/office/word/2010/wordml" xmlns:w15="http://schemas.microsoft.com/office/word/2012/wordml" xmlns:w16cex="http://schemas.microsoft.com/office/word/2018/wordml/cex" xmlns:w16cid="http://schemas.microsoft.com/office/word/2016/wordml/cid" xmlns:w16="http://schemas.microsoft.com/office/word/2018/wordml" xmlns:w16se="http://schemas.microsoft.com/office/word/2015/wordml/symex" xmlns:wpg="http://schemas.microsoft.com/office/word/2010/wordprocessingGroup" xmlns:wpi="http://schemas.microsoft.com/office/word/2010/wordprocessingInk" xmlns:wne="http://schemas.microsoft.com/office/word/2006/wordml" xmlns:wps="http://schemas.microsoft.com/office/word/2010/wordprocessingShape" mc:Ignorable="w14 w15 w16se w16cid w16 w16cex wp14">
   <w:footnote w:type="separator" w:id="-1">
@@ -12092,7 +12109,7 @@
   <w:abstractNum w:abstractNumId="0" w15:restartNumberingAfterBreak="0">
     <w:nsid w:val="FFFFFF7C"/>
     <w:multiLevelType w:val="singleLevel"/>
-    <w:tmpl w:val="4976929C"/>
+    <w:tmpl w:val="15A82C0C"/>
     <w:lvl w:ilvl="0">
       <w:start w:val="1"/>
       <w:numFmt w:val="decimal"/>
@@ -12109,7 +12126,7 @@
   <w:abstractNum w:abstractNumId="1" w15:restartNumberingAfterBreak="0">
     <w:nsid w:val="FFFFFF7D"/>
     <w:multiLevelType w:val="singleLevel"/>
-    <w:tmpl w:val="4816D692"/>
+    <w:tmpl w:val="7DB02AE6"/>
     <w:lvl w:ilvl="0">
       <w:start w:val="1"/>
       <w:numFmt w:val="decimal"/>
@@ -12126,7 +12143,7 @@
   <w:abstractNum w:abstractNumId="2" w15:restartNumberingAfterBreak="0">
     <w:nsid w:val="FFFFFF7E"/>
     <w:multiLevelType w:val="singleLevel"/>
-    <w:tmpl w:val="9AF8B1D2"/>
+    <w:tmpl w:val="434AEA34"/>
     <w:lvl w:ilvl="0">
       <w:start w:val="1"/>
       <w:numFmt w:val="decimal"/>
@@ -12143,7 +12160,7 @@
   <w:abstractNum w:abstractNumId="3" w15:restartNumberingAfterBreak="0">
     <w:nsid w:val="FFFFFF7F"/>
     <w:multiLevelType w:val="singleLevel"/>
-    <w:tmpl w:val="E2AEAD66"/>
+    <w:tmpl w:val="D1880398"/>
     <w:lvl w:ilvl="0">
       <w:start w:val="1"/>
       <w:numFmt w:val="decimal"/>
@@ -12160,7 +12177,7 @@
   <w:abstractNum w:abstractNumId="4" w15:restartNumberingAfterBreak="0">
     <w:nsid w:val="FFFFFF80"/>
     <w:multiLevelType w:val="singleLevel"/>
-    <w:tmpl w:val="90823208"/>
+    <w:tmpl w:val="F5A09E48"/>
     <w:lvl w:ilvl="0">
       <w:start w:val="1"/>
       <w:numFmt w:val="bullet"/>
@@ -12180,7 +12197,7 @@
   <w:abstractNum w:abstractNumId="5" w15:restartNumberingAfterBreak="0">
     <w:nsid w:val="FFFFFF81"/>
     <w:multiLevelType w:val="singleLevel"/>
-    <w:tmpl w:val="73806692"/>
+    <w:tmpl w:val="981A88C8"/>
     <w:lvl w:ilvl="0">
       <w:start w:val="1"/>
       <w:numFmt w:val="bullet"/>
@@ -12200,7 +12217,7 @@
   <w:abstractNum w:abstractNumId="6" w15:restartNumberingAfterBreak="0">
     <w:nsid w:val="FFFFFF82"/>
     <w:multiLevelType w:val="singleLevel"/>
-    <w:tmpl w:val="1206B21C"/>
+    <w:tmpl w:val="CD1EA56C"/>
     <w:lvl w:ilvl="0">
       <w:start w:val="1"/>
       <w:numFmt w:val="bullet"/>
@@ -12220,7 +12237,7 @@
   <w:abstractNum w:abstractNumId="7" w15:restartNumberingAfterBreak="0">
     <w:nsid w:val="FFFFFF83"/>
     <w:multiLevelType w:val="singleLevel"/>
-    <w:tmpl w:val="0FF8DC5A"/>
+    <w:tmpl w:val="7AD47E88"/>
     <w:lvl w:ilvl="0">
       <w:start w:val="1"/>
       <w:numFmt w:val="bullet"/>
@@ -12240,7 +12257,7 @@
   <w:abstractNum w:abstractNumId="8" w15:restartNumberingAfterBreak="0">
     <w:nsid w:val="FFFFFF88"/>
     <w:multiLevelType w:val="singleLevel"/>
-    <w:tmpl w:val="6A00D828"/>
+    <w:tmpl w:val="DC58C3B4"/>
     <w:lvl w:ilvl="0">
       <w:start w:val="1"/>
       <w:numFmt w:val="decimal"/>
@@ -12257,7 +12274,7 @@
   <w:abstractNum w:abstractNumId="9" w15:restartNumberingAfterBreak="0">
     <w:nsid w:val="FFFFFF89"/>
     <w:multiLevelType w:val="singleLevel"/>
-    <w:tmpl w:val="108AD038"/>
+    <w:tmpl w:val="BAB6609C"/>
     <w:lvl w:ilvl="0">
       <w:start w:val="1"/>
       <w:numFmt w:val="bullet"/>
@@ -12437,6 +12454,128 @@
       </w:pPr>
     </w:lvl>
   </w:abstractNum>
+  <w:abstractNum w:abstractNumId="12" w15:restartNumberingAfterBreak="0">
+    <w:nsid w:val="64D45364"/>
+    <w:multiLevelType w:val="multilevel"/>
+    <w:tmpl w:val="7B7A7E4C"/>
+    <w:lvl w:ilvl="0">
+      <w:start w:val="1"/>
+      <w:numFmt w:val="decimal"/>
+      <w:pStyle w:val="Heading1"/>
+      <w:lvlText w:val="%1."/>
+      <w:lvlJc w:val="left"/>
+      <w:pPr>
+        <w:ind w:left="360" w:hanging="360"/>
+      </w:pPr>
+      <w:rPr>
+        <w:rFonts w:hint="default"/>
+      </w:rPr>
+    </w:lvl>
+    <w:lvl w:ilvl="1">
+      <w:start w:val="1"/>
+      <w:numFmt w:val="decimal"/>
+      <w:pStyle w:val="Heading2"/>
+      <w:lvlText w:val="%1.%2"/>
+      <w:lvlJc w:val="left"/>
+      <w:pPr>
+        <w:ind w:left="454" w:hanging="454"/>
+      </w:pPr>
+      <w:rPr>
+        <w:rFonts w:hint="default"/>
+      </w:rPr>
+    </w:lvl>
+    <w:lvl w:ilvl="2">
+      <w:start w:val="1"/>
+      <w:numFmt w:val="decimal"/>
+      <w:pStyle w:val="Heading3"/>
+      <w:lvlText w:val="%1.%2.%3"/>
+      <w:lvlJc w:val="left"/>
+      <w:pPr>
+        <w:ind w:left="624" w:hanging="624"/>
+      </w:pPr>
+      <w:rPr>
+        <w:rFonts w:hint="default"/>
+      </w:rPr>
+    </w:lvl>
+    <w:lvl w:ilvl="3">
+      <w:start w:val="1"/>
+      <w:numFmt w:val="decimal"/>
+      <w:pStyle w:val="Heading4"/>
+      <w:lvlText w:val="%1.%2.%3.%4"/>
+      <w:lvlJc w:val="left"/>
+      <w:pPr>
+        <w:ind w:left="862" w:hanging="862"/>
+      </w:pPr>
+      <w:rPr>
+        <w:rFonts w:hint="default"/>
+      </w:rPr>
+    </w:lvl>
+    <w:lvl w:ilvl="4">
+      <w:start w:val="1"/>
+      <w:numFmt w:val="decimal"/>
+      <w:pStyle w:val="Heading5"/>
+      <w:lvlText w:val="%1.%2.%3.%4.%5"/>
+      <w:lvlJc w:val="left"/>
+      <w:pPr>
+        <w:ind w:left="1008" w:hanging="1008"/>
+      </w:pPr>
+      <w:rPr>
+        <w:rFonts w:hint="default"/>
+      </w:rPr>
+    </w:lvl>
+    <w:lvl w:ilvl="5">
+      <w:start w:val="1"/>
+      <w:numFmt w:val="decimal"/>
+      <w:pStyle w:val="Heading6"/>
+      <w:lvlText w:val="%1.%2.%3.%4.%5.%6"/>
+      <w:lvlJc w:val="left"/>
+      <w:pPr>
+        <w:ind w:left="1152" w:hanging="1152"/>
+      </w:pPr>
+      <w:rPr>
+        <w:rFonts w:hint="default"/>
+      </w:rPr>
+    </w:lvl>
+    <w:lvl w:ilvl="6">
+      <w:start w:val="1"/>
+      <w:numFmt w:val="decimal"/>
+      <w:pStyle w:val="Heading7"/>
+      <w:lvlText w:val="%1.%2.%3.%4.%5.%6.%7"/>
+      <w:lvlJc w:val="left"/>
+      <w:pPr>
+        <w:ind w:left="1296" w:hanging="1296"/>
+      </w:pPr>
+      <w:rPr>
+        <w:rFonts w:hint="default"/>
+      </w:rPr>
+    </w:lvl>
+    <w:lvl w:ilvl="7">
+      <w:start w:val="1"/>
+      <w:numFmt w:val="decimal"/>
+      <w:pStyle w:val="Heading8"/>
+      <w:lvlText w:val="%1.%2.%3.%4.%5.%6.%7.%8"/>
+      <w:lvlJc w:val="left"/>
+      <w:pPr>
+        <w:ind w:left="1440" w:hanging="1440"/>
+      </w:pPr>
+      <w:rPr>
+        <w:rFonts w:hint="default"/>
+      </w:rPr>
+    </w:lvl>
+    <w:lvl w:ilvl="8">
+      <w:start w:val="1"/>
+      <w:numFmt w:val="decimal"/>
+      <w:pStyle w:val="Heading9"/>
+      <w:lvlText w:val="%1.%2.%3.%4.%5.%6.%7.%8.%9"/>
+      <w:lvlJc w:val="left"/>
+      <w:pPr>
+        <w:ind w:left="1584" w:hanging="1584"/>
+      </w:pPr>
+      <w:rPr>
+        <w:rFonts w:hint="default"/>
+      </w:rPr>
+    </w:lvl>
+  </w:abstractNum>
   <w:num w:numId="1">
     <w:abstractNumId w:val="10"/>
   </w:num>
@@ -12472,6 +12611,9 @@
   </w:num>
   <w:num w:numId="12">
     <w:abstractNumId w:val="11"/>
+  </w:num>
+  <w:num w:numId="13">
+    <w:abstractNumId w:val="12"/>
   </w:num>
 </w:numbering>
 </file>
@@ -12516,7 +12658,7 @@
     <w:lsdException w:name="footnote text" w:semiHidden="1" w:unhideWhenUsed="1"/>
     <w:lsdException w:name="annotation text" w:semiHidden="1" w:unhideWhenUsed="1"/>
     <w:lsdException w:name="header" w:semiHidden="1" w:unhideWhenUsed="1"/>
-    <w:lsdException w:name="footer" w:semiHidden="1" w:unhideWhenUsed="1"/>
+    <w:lsdException w:name="footer" w:semiHidden="1" w:uiPriority="99" w:unhideWhenUsed="1"/>
     <w:lsdException w:name="index heading" w:semiHidden="1" w:unhideWhenUsed="1"/>
     <w:lsdException w:name="caption" w:semiHidden="1" w:unhideWhenUsed="1"/>
     <w:lsdException w:name="table of figures" w:semiHidden="1" w:unhideWhenUsed="1"/>
@@ -12834,7 +12976,7 @@
   <w:style w:type="paragraph" w:default="1" w:styleId="Normal">
     <w:name w:val="Normal"/>
     <w:qFormat/>
-    <w:rsid w:val="007E341E"/>
+    <w:rsid w:val="00AC6656"/>
     <w:rPr>
       <w:rFonts w:ascii="Arial" w:hAnsi="Arial"/>
     </w:rPr>
@@ -12845,10 +12987,13 @@
     <w:next w:val="BodyText"/>
     <w:uiPriority w:val="9"/>
     <w:qFormat/>
-    <w:rsid w:val="00BA6A34"/>
+    <w:rsid w:val="00412B3F"/>
     <w:pPr>
       <w:keepNext/>
       <w:keepLines/>
+      <w:numPr>
+        <w:numId w:val="13"/>
+      </w:numPr>
       <w:spacing w:before="480" w:after="0"/>
       <w:outlineLvl w:val="0"/>
     </w:pPr>
@@ -12866,11 +13011,15 @@
     <w:uiPriority w:val="9"/>
     <w:unhideWhenUsed/>
     <w:qFormat/>
-    <w:rsid w:val="00260CB9"/>
+    <w:rsid w:val="006E231A"/>
     <w:pPr>
       <w:keepNext/>
       <w:keepLines/>
-      <w:spacing w:before="200" w:after="0"/>
+      <w:numPr>
+        <w:ilvl w:val="1"/>
+        <w:numId w:val="13"/>
+      </w:numPr>
+      <w:spacing w:before="240" w:after="0"/>
       <w:outlineLvl w:val="1"/>
     </w:pPr>
     <w:rPr>
@@ -12891,6 +13040,10 @@
     <w:pPr>
       <w:keepNext/>
       <w:keepLines/>
+      <w:numPr>
+        <w:ilvl w:val="2"/>
+        <w:numId w:val="13"/>
+      </w:numPr>
       <w:spacing w:before="200" w:after="0"/>
       <w:outlineLvl w:val="2"/>
     </w:pPr>
@@ -12910,6 +13063,10 @@
     <w:pPr>
       <w:keepNext/>
       <w:keepLines/>
+      <w:numPr>
+        <w:ilvl w:val="3"/>
+        <w:numId w:val="13"/>
+      </w:numPr>
       <w:spacing w:before="200" w:after="0"/>
       <w:outlineLvl w:val="3"/>
     </w:pPr>
@@ -12931,6 +13088,10 @@
     <w:pPr>
       <w:keepNext/>
       <w:keepLines/>
+      <w:numPr>
+        <w:ilvl w:val="4"/>
+        <w:numId w:val="13"/>
+      </w:numPr>
       <w:spacing w:before="200" w:after="0"/>
       <w:outlineLvl w:val="4"/>
     </w:pPr>
@@ -12951,6 +13112,10 @@
     <w:pPr>
       <w:keepNext/>
       <w:keepLines/>
+      <w:numPr>
+        <w:ilvl w:val="5"/>
+        <w:numId w:val="13"/>
+      </w:numPr>
       <w:spacing w:before="200" w:after="0"/>
       <w:outlineLvl w:val="5"/>
     </w:pPr>
@@ -12970,6 +13135,10 @@
     <w:pPr>
       <w:keepNext/>
       <w:keepLines/>
+      <w:numPr>
+        <w:ilvl w:val="6"/>
+        <w:numId w:val="13"/>
+      </w:numPr>
       <w:spacing w:before="200" w:after="0"/>
       <w:outlineLvl w:val="6"/>
     </w:pPr>
@@ -12989,6 +13158,10 @@
     <w:pPr>
       <w:keepNext/>
       <w:keepLines/>
+      <w:numPr>
+        <w:ilvl w:val="7"/>
+        <w:numId w:val="13"/>
+      </w:numPr>
       <w:spacing w:before="200" w:after="0"/>
       <w:outlineLvl w:val="7"/>
     </w:pPr>
@@ -13008,6 +13181,10 @@
     <w:pPr>
       <w:keepNext/>
       <w:keepLines/>
+      <w:numPr>
+        <w:ilvl w:val="8"/>
+        <w:numId w:val="13"/>
+      </w:numPr>
       <w:spacing w:before="200" w:after="0"/>
       <w:outlineLvl w:val="8"/>
     </w:pPr>
@@ -13345,9 +13522,12 @@
     <w:uiPriority w:val="39"/>
     <w:unhideWhenUsed/>
     <w:qFormat/>
-    <w:rsid w:val="00BA6A34"/>
+    <w:rsid w:val="00AC6656"/>
     <w:pPr>
-      <w:spacing w:before="240" w:line="259" w:lineRule="auto"/>
+      <w:numPr>
+        <w:numId w:val="0"/>
+      </w:numPr>
+      <w:spacing w:after="240" w:line="259" w:lineRule="auto"/>
       <w:outlineLvl w:val="9"/>
     </w:pPr>
     <w:rPr>
@@ -13755,9 +13935,14 @@
     <w:autoRedefine/>
     <w:uiPriority w:val="39"/>
     <w:unhideWhenUsed/>
-    <w:rsid w:val="002F331B"/>
+    <w:rsid w:val="00CA78A2"/>
     <w:pPr>
-      <w:spacing w:after="100"/>
+      <w:tabs>
+        <w:tab w:val="left" w:pos="480"/>
+        <w:tab w:val="right" w:leader="dot" w:pos="9923"/>
+      </w:tabs>
+      <w:spacing w:before="240" w:after="100"/>
+      <w:ind w:left="482" w:hanging="482"/>
     </w:pPr>
   </w:style>
   <w:style w:type="paragraph" w:styleId="TOC2">
@@ -13767,10 +13952,15 @@
     <w:autoRedefine/>
     <w:uiPriority w:val="39"/>
     <w:unhideWhenUsed/>
-    <w:rsid w:val="007E341E"/>
+    <w:rsid w:val="00CA78A2"/>
     <w:pPr>
-      <w:spacing w:after="100"/>
-      <w:ind w:left="240"/>
+      <w:tabs>
+        <w:tab w:val="left" w:pos="880"/>
+        <w:tab w:val="right" w:leader="dot" w:pos="9923"/>
+      </w:tabs>
+      <w:spacing w:after="120"/>
+      <w:ind w:left="238"/>
+      <w:contextualSpacing/>
     </w:pPr>
   </w:style>
   <w:style w:type="paragraph" w:styleId="TOC3">
@@ -13780,10 +13970,15 @@
     <w:autoRedefine/>
     <w:uiPriority w:val="39"/>
     <w:unhideWhenUsed/>
-    <w:rsid w:val="007E341E"/>
+    <w:rsid w:val="00CA78A2"/>
     <w:pPr>
+      <w:tabs>
+        <w:tab w:val="left" w:pos="1320"/>
+        <w:tab w:val="right" w:leader="dot" w:pos="9923"/>
+      </w:tabs>
       <w:spacing w:after="100"/>
-      <w:ind w:left="480"/>
+      <w:ind w:left="482"/>
+      <w:contextualSpacing/>
     </w:pPr>
   </w:style>
   <w:style w:type="paragraph" w:styleId="List2">
@@ -13845,6 +14040,7 @@
     <w:name w:val="footer"/>
     <w:basedOn w:val="Normal"/>
     <w:link w:val="FooterChar"/>
+    <w:uiPriority w:val="99"/>
     <w:unhideWhenUsed/>
     <w:rsid w:val="007E341E"/>
     <w:pPr>
@@ -13859,6 +14055,7 @@
     <w:name w:val="Footer Char"/>
     <w:basedOn w:val="DefaultParagraphFont"/>
     <w:link w:val="Footer"/>
+    <w:uiPriority w:val="99"/>
     <w:rsid w:val="007E341E"/>
     <w:rPr>
       <w:rFonts w:ascii="Arial" w:hAnsi="Arial"/>

</xml_diff>

<commit_message>
Added multivariate outlier and data.table import sections.
</commit_message>
<xml_diff>
--- a/QCPA_r-script-doc-styles.docx
+++ b/QCPA_r-script-doc-styles.docx
@@ -11985,6 +11985,159 @@
     </w:p>
     <w:p>
       <w:pPr>
+        <w:pStyle w:val="Heading1"/>
+      </w:pPr>
+      <w:bookmarkStart w:id="39" w:name="_Toc147248746"/>
+      <w:bookmarkStart w:id="40" w:name="references"/>
+      <w:r>
+        <w:t>References</w:t>
+      </w:r>
+      <w:bookmarkEnd w:id="39"/>
+    </w:p>
+    <w:p>
+      <w:pPr>
+        <w:pStyle w:val="BodyText"/>
+      </w:pPr>
+    </w:p>
+    <w:p>
+      <w:pPr>
+        <w:pStyle w:val="Bibliography"/>
+      </w:pPr>
+      <w:bookmarkStart w:id="41" w:name="refs"/>
+      <w:proofErr w:type="spellStart"/>
+      <w:r>
+        <w:t>Dowle</w:t>
+      </w:r>
+      <w:proofErr w:type="spellEnd"/>
+      <w:r>
+        <w:t xml:space="preserve">, Matt, and Arun Srinivasan. 2023. </w:t>
+      </w:r>
+      <w:r>
+        <w:rPr>
+          <w:i/>
+          <w:iCs/>
+        </w:rPr>
+        <w:t xml:space="preserve">Data.table: </w:t>
+      </w:r>
+      <w:r>
+        <w:t>Extension</w:t>
+      </w:r>
+      <w:r>
+        <w:rPr>
+          <w:i/>
+          <w:iCs/>
+        </w:rPr>
+        <w:t xml:space="preserve"> of ‘</w:t>
+      </w:r>
+      <w:proofErr w:type="spellStart"/>
+      <w:r>
+        <w:rPr>
+          <w:i/>
+          <w:iCs/>
+        </w:rPr>
+        <w:t>Data.frame</w:t>
+      </w:r>
+      <w:proofErr w:type="spellEnd"/>
+      <w:r>
+        <w:rPr>
+          <w:i/>
+          <w:iCs/>
+        </w:rPr>
+        <w:t>‘</w:t>
+      </w:r>
+      <w:r>
+        <w:t xml:space="preserve">. </w:t>
+      </w:r>
+      <w:hyperlink r:id="rId7" w:history="1">
+        <w:r>
+          <w:rPr>
+            <w:rStyle w:val="Hyperlink"/>
+            <w:u w:val="single"/>
+          </w:rPr>
+          <w:t>https://CRAN.R-project.org/package=data.table</w:t>
+        </w:r>
+      </w:hyperlink>
+      <w:r>
+        <w:t>.</w:t>
+      </w:r>
+    </w:p>
+    <w:p>
+      <w:pPr>
+        <w:pStyle w:val="Bibliography"/>
+      </w:pPr>
+      <w:bookmarkStart w:id="42" w:name="ref-datatable"/>
+      <w:bookmarkEnd w:id="42"/>
+      <w:r>
+        <w:t xml:space="preserve">Harrison, Xavier A, Lynda Donaldson, Maria Eugenia Correa-Cano, Julian Evans, David N Fisher, Cecily ED Goodwin, Beth S Robinson, David J Hodgson, and Richard Inger. 2018. “A Brief Introduction to Mixed Effects Modelling and Multi-Model Inference in Ecology.” </w:t>
+      </w:r>
+      <w:proofErr w:type="spellStart"/>
+      <w:r>
+        <w:rPr>
+          <w:i/>
+          <w:iCs/>
+        </w:rPr>
+        <w:t>PeerJ</w:t>
+      </w:r>
+      <w:proofErr w:type="spellEnd"/>
+      <w:r>
+        <w:t xml:space="preserve"> 6: e4794.</w:t>
+      </w:r>
+    </w:p>
+    <w:p>
+      <w:pPr>
+        <w:pStyle w:val="Bibliography"/>
+      </w:pPr>
+      <w:bookmarkStart w:id="43" w:name="ref-Harrison2018"/>
+      <w:bookmarkStart w:id="44" w:name="ref-van2020"/>
+      <w:bookmarkEnd w:id="43"/>
+      <w:r>
+        <w:t xml:space="preserve">van den Berg, Cedric P, Jolyon </w:t>
+      </w:r>
+      <w:proofErr w:type="spellStart"/>
+      <w:r>
+        <w:t>Troscianko</w:t>
+      </w:r>
+      <w:proofErr w:type="spellEnd"/>
+      <w:r>
+        <w:t xml:space="preserve">, John A Endler, N Justin Marshall, and Karen L Cheney. 2020. “Quantitative </w:t>
+      </w:r>
+      <w:proofErr w:type="spellStart"/>
+      <w:r>
+        <w:t>Colour</w:t>
+      </w:r>
+      <w:proofErr w:type="spellEnd"/>
+      <w:r>
+        <w:t xml:space="preserve"> Pattern Analysis (QCPA): A Comprehensive Framework for the Analysis of </w:t>
+      </w:r>
+      <w:proofErr w:type="spellStart"/>
+      <w:r>
+        <w:t>Colour</w:t>
+      </w:r>
+      <w:proofErr w:type="spellEnd"/>
+      <w:r>
+        <w:t xml:space="preserve"> Patterns in Nature.” </w:t>
+      </w:r>
+      <w:r>
+        <w:rPr>
+          <w:i/>
+          <w:iCs/>
+        </w:rPr>
+        <w:t>Methods in Ecology and Evolution</w:t>
+      </w:r>
+      <w:r>
+        <w:t xml:space="preserve"> 11 (2): 316–32.</w:t>
+      </w:r>
+      <w:bookmarkEnd w:id="40"/>
+      <w:bookmarkEnd w:id="41"/>
+      <w:bookmarkEnd w:id="44"/>
+    </w:p>
+    <w:p>
+      <w:pPr>
+        <w:pStyle w:val="BodyText"/>
+      </w:pPr>
+    </w:p>
+    <w:p>
+      <w:pPr>
         <w:pStyle w:val="List2"/>
         <w:rPr>
           <w:rStyle w:val="FunctionTok"/>
@@ -11992,7 +12145,7 @@
       </w:pPr>
     </w:p>
     <w:sectPr>
-      <w:footerReference w:type="default" r:id="rId7"/>
+      <w:footerReference w:type="default" r:id="rId8"/>
       <w:pgSz w:w="12240" w:h="15840"/>
       <w:pgMar w:top="1134" w:right="1134" w:bottom="1134" w:left="1134" w:header="720" w:footer="267" w:gutter="0"/>
       <w:cols w:space="720"/>
@@ -12615,6 +12768,36 @@
   <w:num w:numId="13">
     <w:abstractNumId w:val="12"/>
   </w:num>
+  <w:num w:numId="14">
+    <w:abstractNumId w:val="12"/>
+    <w:lvlOverride w:ilvl="0">
+      <w:startOverride w:val="1"/>
+    </w:lvlOverride>
+    <w:lvlOverride w:ilvl="1">
+      <w:startOverride w:val="1"/>
+    </w:lvlOverride>
+    <w:lvlOverride w:ilvl="2">
+      <w:startOverride w:val="1"/>
+    </w:lvlOverride>
+    <w:lvlOverride w:ilvl="3">
+      <w:startOverride w:val="1"/>
+    </w:lvlOverride>
+    <w:lvlOverride w:ilvl="4">
+      <w:startOverride w:val="1"/>
+    </w:lvlOverride>
+    <w:lvlOverride w:ilvl="5">
+      <w:startOverride w:val="1"/>
+    </w:lvlOverride>
+    <w:lvlOverride w:ilvl="6">
+      <w:startOverride w:val="1"/>
+    </w:lvlOverride>
+    <w:lvlOverride w:ilvl="7">
+      <w:startOverride w:val="1"/>
+    </w:lvlOverride>
+    <w:lvlOverride w:ilvl="8">
+      <w:startOverride w:val="1"/>
+    </w:lvlOverride>
+  </w:num>
 </w:numbering>
 </file>
 
@@ -12985,6 +13168,7 @@
     <w:name w:val="heading 1"/>
     <w:basedOn w:val="Normal"/>
     <w:next w:val="BodyText"/>
+    <w:link w:val="Heading1Char"/>
     <w:uiPriority w:val="9"/>
     <w:qFormat/>
     <w:rsid w:val="00412B3F"/>
@@ -13355,7 +13539,10 @@
     <w:name w:val="Bibliography"/>
     <w:basedOn w:val="Normal"/>
     <w:qFormat/>
-    <w:rsid w:val="007E341E"/>
+    <w:rsid w:val="00B40D70"/>
+    <w:pPr>
+      <w:ind w:left="720" w:hanging="720"/>
+    </w:pPr>
   </w:style>
   <w:style w:type="paragraph" w:styleId="BlockText">
     <w:name w:val="Block Text"/>
@@ -14098,6 +14285,19 @@
       <w:szCs w:val="20"/>
     </w:rPr>
   </w:style>
+  <w:style w:type="character" w:customStyle="1" w:styleId="Heading1Char">
+    <w:name w:val="Heading 1 Char"/>
+    <w:basedOn w:val="DefaultParagraphFont"/>
+    <w:link w:val="Heading1"/>
+    <w:uiPriority w:val="9"/>
+    <w:rsid w:val="00B40D70"/>
+    <w:rPr>
+      <w:rFonts w:ascii="Arial" w:eastAsiaTheme="majorEastAsia" w:hAnsi="Arial" w:cs="Arial"/>
+      <w:color w:val="4F81BD" w:themeColor="accent1"/>
+      <w:sz w:val="32"/>
+      <w:szCs w:val="32"/>
+    </w:rPr>
+  </w:style>
 </w:styles>
 </file>
 

</xml_diff>